<commit_message>
Update portfolio styling, header, and resume data
</commit_message>
<xml_diff>
--- a/public/documents/Pavit_Agrawal_Software_Engineer_CV.docx
+++ b/public/documents/Pavit_Agrawal_Software_Engineer_CV.docx
@@ -96,8 +96,9 @@
         <w:spacing w:after="200"/>
         <w:jc w:val="both"/>
       </w:pPr>
-      <w:r>
-        <w:t xml:space="preserve">Full-stack software engineer with demonstrated expertise in building scalable, production-grade applications spanning backend services, frontend interfaces, and AI-driven systems. Proficient in modern architectures (microservices, serverless), cloud platforms, and advanced technologies including agentic AI, multimodal systems, and spatial intelligence. Proven ability to design and deliver end-to-end solutions from concept to deployment. Strong problem-solving skills with hands-on experience in fraud detection, compliance systems, and high-performance data processing. Passionate about clean code, system design, and leveraging cutting-edge technologies to solve complex problems.</w:t>
+      <w:r/>
+      <w:r>
+        <w:t>Versatile early-career engineer with a strong data and analytics foundation and hands-on experience across software development, backend services, responsive web applications, and applied machine learning. Skilled in Python, SQL, exploratory data analysis, dashboards, APIs, and modern cloud-ready systems. Brings structured problem-solving, clear communication, and end-to-end delivery skills to data analytics, software engineering, backend, frontend, and ML roles.</w:t>
       </w:r>
     </w:p>
     <w:p>

</xml_diff>